<commit_message>
Document has gotten more good info.
</commit_message>
<xml_diff>
--- a/Tech Meets Magic.docx
+++ b/Tech Meets Magic.docx
@@ -1046,6 +1046,1098 @@
         <w:t>Interactionitest</w:t>
       </w:r>
       <w:proofErr w:type="spellEnd"/>
+    </w:p>
+    <w:p>
+      <w:pPr>
+        <w:pStyle w:val="Loendilik"/>
+        <w:numPr>
+          <w:ilvl w:val="0"/>
+          <w:numId w:val="6"/>
+        </w:numPr>
+      </w:pPr>
+      <w:r>
+        <w:t>Email (TUNNIS)</w:t>
+      </w:r>
+      <w:r>
+        <w:t xml:space="preserve"> </w:t>
+      </w:r>
+    </w:p>
+    <w:p>
+      <w:pPr>
+        <w:pStyle w:val="Loendilik"/>
+        <w:numPr>
+          <w:ilvl w:val="1"/>
+          <w:numId w:val="3"/>
+        </w:numPr>
+      </w:pPr>
+      <w:proofErr w:type="spellStart"/>
+      <w:r>
+        <w:t>Admin</w:t>
+      </w:r>
+      <w:proofErr w:type="spellEnd"/>
+      <w:r>
+        <w:t xml:space="preserve"> saab kasutada emaili saatmise vaadet </w:t>
+      </w:r>
+      <w:r>
+        <w:rPr>
+          <w:rFonts w:ascii="Segoe UI Emoji" w:hAnsi="Segoe UI Emoji" w:cs="Segoe UI Emoji"/>
+        </w:rPr>
+        <w:t>✅</w:t>
+      </w:r>
+    </w:p>
+    <w:p>
+      <w:pPr>
+        <w:pStyle w:val="Loendilik"/>
+        <w:numPr>
+          <w:ilvl w:val="1"/>
+          <w:numId w:val="3"/>
+        </w:numPr>
+      </w:pPr>
+      <w:r>
+        <w:t xml:space="preserve">Mängija saab </w:t>
+      </w:r>
+      <w:proofErr w:type="spellStart"/>
+      <w:r>
+        <w:t>registreerimisconfirmation</w:t>
+      </w:r>
+      <w:proofErr w:type="spellEnd"/>
+      <w:r>
+        <w:t xml:space="preserve"> kirju </w:t>
+      </w:r>
+      <w:r>
+        <w:rPr>
+          <w:rFonts w:ascii="Segoe UI Emoji" w:hAnsi="Segoe UI Emoji" w:cs="Segoe UI Emoji"/>
+        </w:rPr>
+        <w:t>✅</w:t>
+      </w:r>
+    </w:p>
+    <w:p>
+      <w:pPr>
+        <w:pStyle w:val="Loendilik"/>
+        <w:numPr>
+          <w:ilvl w:val="0"/>
+          <w:numId w:val="6"/>
+        </w:numPr>
+      </w:pPr>
+      <w:r>
+        <w:t xml:space="preserve">Mängijaprofiil (JAGATUD) </w:t>
+      </w:r>
+    </w:p>
+    <w:p>
+      <w:pPr>
+        <w:pStyle w:val="Loendilik"/>
+        <w:numPr>
+          <w:ilvl w:val="1"/>
+          <w:numId w:val="3"/>
+        </w:numPr>
+      </w:pPr>
+      <w:r>
+        <w:t xml:space="preserve">Igal kasutajal on juures mängijaprofiil </w:t>
+      </w:r>
+      <w:r>
+        <w:rPr>
+          <w:rFonts w:ascii="Segoe UI Emoji" w:hAnsi="Segoe UI Emoji" w:cs="Segoe UI Emoji"/>
+        </w:rPr>
+        <w:t>✅</w:t>
+      </w:r>
+    </w:p>
+    <w:p>
+      <w:pPr>
+        <w:pStyle w:val="Loendilik"/>
+        <w:numPr>
+          <w:ilvl w:val="2"/>
+          <w:numId w:val="3"/>
+        </w:numPr>
+      </w:pPr>
+      <w:r>
+        <w:t xml:space="preserve">Profiil genereeritakse siis kui kasutaja registreerub </w:t>
+      </w:r>
+      <w:r>
+        <w:rPr>
+          <w:rFonts w:ascii="Segoe UI Emoji" w:hAnsi="Segoe UI Emoji" w:cs="Segoe UI Emoji"/>
+        </w:rPr>
+        <w:t>✅</w:t>
+      </w:r>
+    </w:p>
+    <w:p>
+      <w:pPr>
+        <w:pStyle w:val="Loendilik"/>
+        <w:numPr>
+          <w:ilvl w:val="2"/>
+          <w:numId w:val="3"/>
+        </w:numPr>
+      </w:pPr>
+      <w:r>
+        <w:t xml:space="preserve">Esimese asjana kuvatakse profiiliseadistusvaade </w:t>
+      </w:r>
+      <w:r>
+        <w:rPr>
+          <w:rFonts w:ascii="Segoe UI Emoji" w:hAnsi="Segoe UI Emoji" w:cs="Segoe UI Emoji"/>
+        </w:rPr>
+        <w:t>✅</w:t>
+      </w:r>
+    </w:p>
+    <w:p>
+      <w:pPr>
+        <w:pStyle w:val="Loendilik"/>
+        <w:numPr>
+          <w:ilvl w:val="1"/>
+          <w:numId w:val="3"/>
+        </w:numPr>
+      </w:pPr>
+      <w:r>
+        <w:t>Kasutajale kuvatakse vaated vastavalt profiilile</w:t>
+      </w:r>
+    </w:p>
+    <w:p>
+      <w:pPr>
+        <w:pStyle w:val="Loendilik"/>
+        <w:numPr>
+          <w:ilvl w:val="1"/>
+          <w:numId w:val="3"/>
+        </w:numPr>
+      </w:pPr>
+      <w:r>
+        <w:t xml:space="preserve">mängijaprofiil on juures </w:t>
+      </w:r>
+      <w:proofErr w:type="spellStart"/>
+      <w:r>
+        <w:t>adminituvastus</w:t>
+      </w:r>
+      <w:proofErr w:type="spellEnd"/>
+      <w:r>
+        <w:t xml:space="preserve"> et kuvada:</w:t>
+      </w:r>
+    </w:p>
+    <w:p>
+      <w:pPr>
+        <w:pStyle w:val="Loendilik"/>
+        <w:numPr>
+          <w:ilvl w:val="2"/>
+          <w:numId w:val="3"/>
+        </w:numPr>
+      </w:pPr>
+      <w:r>
+        <w:t xml:space="preserve">adminile </w:t>
+      </w:r>
+      <w:proofErr w:type="spellStart"/>
+      <w:r>
+        <w:t>adminvaated</w:t>
+      </w:r>
+      <w:proofErr w:type="spellEnd"/>
+    </w:p>
+    <w:p>
+      <w:pPr>
+        <w:pStyle w:val="Loendilik"/>
+        <w:numPr>
+          <w:ilvl w:val="2"/>
+          <w:numId w:val="3"/>
+        </w:numPr>
+      </w:pPr>
+      <w:r>
+        <w:t>mängijale mängijavaated</w:t>
+      </w:r>
+    </w:p>
+    <w:p/>
+    <w:p/>
+    <w:p/>
+    <w:p>
+      <w:pPr>
+        <w:pStyle w:val="Loendilik"/>
+        <w:numPr>
+          <w:ilvl w:val="0"/>
+          <w:numId w:val="6"/>
+        </w:numPr>
+      </w:pPr>
+      <w:proofErr w:type="spellStart"/>
+      <w:r>
+        <w:lastRenderedPageBreak/>
+        <w:t>Gameloop</w:t>
+      </w:r>
+      <w:proofErr w:type="spellEnd"/>
+      <w:r>
+        <w:t xml:space="preserve"> [JAGATUD]</w:t>
+      </w:r>
+    </w:p>
+    <w:p>
+      <w:pPr>
+        <w:pStyle w:val="Loendilik"/>
+        <w:numPr>
+          <w:ilvl w:val="0"/>
+          <w:numId w:val="8"/>
+        </w:numPr>
+      </w:pPr>
+      <w:r>
+        <w:t>Mängijavaade[KODUS]</w:t>
+      </w:r>
+    </w:p>
+    <w:p>
+      <w:pPr>
+        <w:pStyle w:val="Loendilik"/>
+        <w:numPr>
+          <w:ilvl w:val="2"/>
+          <w:numId w:val="3"/>
+        </w:numPr>
+      </w:pPr>
+      <w:r>
+        <w:t xml:space="preserve">Mängija saab navigeerida kogu </w:t>
+      </w:r>
+      <w:proofErr w:type="spellStart"/>
+      <w:r>
+        <w:t>Realm’i</w:t>
+      </w:r>
+      <w:proofErr w:type="spellEnd"/>
+      <w:r>
+        <w:t>:</w:t>
+      </w:r>
+    </w:p>
+    <w:p>
+      <w:pPr>
+        <w:pStyle w:val="Loendilik"/>
+        <w:numPr>
+          <w:ilvl w:val="2"/>
+          <w:numId w:val="3"/>
+        </w:numPr>
+      </w:pPr>
+      <w:r>
+        <w:t xml:space="preserve">Mängija saab </w:t>
+      </w:r>
+    </w:p>
+    <w:p>
+      <w:pPr>
+        <w:pStyle w:val="Loendilik"/>
+        <w:numPr>
+          <w:ilvl w:val="2"/>
+          <w:numId w:val="3"/>
+        </w:numPr>
+      </w:pPr>
+      <w:r>
+        <w:t xml:space="preserve">Mängija saab </w:t>
+      </w:r>
+    </w:p>
+    <w:p>
+      <w:pPr>
+        <w:pStyle w:val="Loendilik"/>
+        <w:numPr>
+          <w:ilvl w:val="2"/>
+          <w:numId w:val="3"/>
+        </w:numPr>
+        <w:rPr>
+          <w:color w:val="FF0000"/>
+        </w:rPr>
+      </w:pPr>
+      <w:r>
+        <w:t xml:space="preserve">Mängija saab </w:t>
+      </w:r>
+    </w:p>
+    <w:p>
+      <w:pPr>
+        <w:pStyle w:val="Loendilik"/>
+        <w:numPr>
+          <w:ilvl w:val="2"/>
+          <w:numId w:val="3"/>
+        </w:numPr>
+      </w:pPr>
+      <w:r>
+        <w:t xml:space="preserve">Mängija saab näha oma surnud </w:t>
+      </w:r>
+      <w:proofErr w:type="spellStart"/>
+      <w:r>
+        <w:t>Companione</w:t>
+      </w:r>
+      <w:proofErr w:type="spellEnd"/>
+    </w:p>
+    <w:p>
+      <w:pPr>
+        <w:pStyle w:val="Loendilik"/>
+        <w:numPr>
+          <w:ilvl w:val="0"/>
+          <w:numId w:val="8"/>
+        </w:numPr>
+      </w:pPr>
+      <w:proofErr w:type="spellStart"/>
+      <w:r>
+        <w:t>StoryQuest</w:t>
+      </w:r>
+      <w:proofErr w:type="spellEnd"/>
+      <w:r>
+        <w:t xml:space="preserve"> [KLASSIS]</w:t>
+      </w:r>
+    </w:p>
+    <w:p>
+      <w:pPr>
+        <w:pStyle w:val="Loendilik"/>
+        <w:numPr>
+          <w:ilvl w:val="6"/>
+          <w:numId w:val="9"/>
+        </w:numPr>
+      </w:pPr>
+      <w:r>
+        <w:t>Looelemendid</w:t>
+      </w:r>
+    </w:p>
+    <w:p>
+      <w:pPr>
+        <w:pStyle w:val="Loendilik"/>
+        <w:numPr>
+          <w:ilvl w:val="3"/>
+          <w:numId w:val="3"/>
+        </w:numPr>
+      </w:pPr>
+      <w:proofErr w:type="spellStart"/>
+      <w:r>
+        <w:t>Name</w:t>
+      </w:r>
+      <w:proofErr w:type="spellEnd"/>
+      <w:r>
+        <w:t xml:space="preserve"> of </w:t>
+      </w:r>
+      <w:proofErr w:type="spellStart"/>
+      <w:r>
+        <w:t>Event</w:t>
+      </w:r>
+      <w:proofErr w:type="spellEnd"/>
+    </w:p>
+    <w:p>
+      <w:pPr>
+        <w:pStyle w:val="Loendilik"/>
+        <w:numPr>
+          <w:ilvl w:val="3"/>
+          <w:numId w:val="3"/>
+        </w:numPr>
+      </w:pPr>
+      <w:r>
+        <w:t>Image</w:t>
+      </w:r>
+    </w:p>
+    <w:p>
+      <w:pPr>
+        <w:pStyle w:val="Loendilik"/>
+        <w:numPr>
+          <w:ilvl w:val="3"/>
+          <w:numId w:val="3"/>
+        </w:numPr>
+      </w:pPr>
+      <w:proofErr w:type="spellStart"/>
+      <w:r>
+        <w:t>Text</w:t>
+      </w:r>
+      <w:proofErr w:type="spellEnd"/>
+    </w:p>
+    <w:p>
+      <w:pPr>
+        <w:pStyle w:val="Loendilik"/>
+        <w:numPr>
+          <w:ilvl w:val="3"/>
+          <w:numId w:val="3"/>
+        </w:numPr>
+      </w:pPr>
+      <w:proofErr w:type="spellStart"/>
+      <w:r>
+        <w:t>Options</w:t>
+      </w:r>
+      <w:proofErr w:type="spellEnd"/>
+    </w:p>
+    <w:p>
+      <w:pPr>
+        <w:pStyle w:val="Loendilik"/>
+        <w:numPr>
+          <w:ilvl w:val="3"/>
+          <w:numId w:val="3"/>
+        </w:numPr>
+      </w:pPr>
+      <w:r>
+        <w:t>Näide:</w:t>
+      </w:r>
+      <w:r>
+        <w:br/>
+      </w:r>
+    </w:p>
+    <w:tbl>
+      <w:tblPr>
+        <w:tblStyle w:val="Kontuurtabel"/>
+        <w:tblW w:w="0" w:type="auto"/>
+        <w:tblInd w:w="2880" w:type="dxa"/>
+        <w:tblLook w:val="04A0" w:firstRow="1" w:lastRow="0" w:firstColumn="1" w:lastColumn="0" w:noHBand="0" w:noVBand="1"/>
+      </w:tblPr>
+      <w:tblGrid>
+        <w:gridCol w:w="6182"/>
+      </w:tblGrid>
+      <w:tr>
+        <w:tc>
+          <w:tcPr>
+            <w:tcW w:w="9062" w:type="dxa"/>
+          </w:tcPr>
+          <w:p>
+            <w:pPr>
+              <w:pStyle w:val="Loendilik"/>
+              <w:ind w:left="0"/>
+            </w:pPr>
+            <w:proofErr w:type="spellStart"/>
+            <w:r>
+              <w:t>Storyname</w:t>
+            </w:r>
+            <w:proofErr w:type="spellEnd"/>
+            <w:r>
+              <w:t xml:space="preserve">: </w:t>
+            </w:r>
+            <w:proofErr w:type="spellStart"/>
+            <w:r>
+              <w:t>Ancient</w:t>
+            </w:r>
+            <w:proofErr w:type="spellEnd"/>
+            <w:r>
+              <w:t xml:space="preserve"> </w:t>
+            </w:r>
+            <w:proofErr w:type="spellStart"/>
+            <w:r>
+              <w:t>Gun</w:t>
+            </w:r>
+            <w:proofErr w:type="spellEnd"/>
+            <w:r>
+              <w:t xml:space="preserve"> </w:t>
+            </w:r>
+            <w:proofErr w:type="spellStart"/>
+            <w:r>
+              <w:t>Hole</w:t>
+            </w:r>
+            <w:proofErr w:type="spellEnd"/>
+            <w:r>
+              <w:t>.</w:t>
+            </w:r>
+          </w:p>
+        </w:tc>
+      </w:tr>
+      <w:tr>
+        <w:tc>
+          <w:tcPr>
+            <w:tcW w:w="9062" w:type="dxa"/>
+          </w:tcPr>
+          <w:p>
+            <w:pPr>
+              <w:pStyle w:val="Loendilik"/>
+              <w:ind w:left="0"/>
+            </w:pPr>
+            <w:r>
+              <w:t>&lt;-&gt;</w:t>
+            </w:r>
+          </w:p>
+        </w:tc>
+      </w:tr>
+      <w:tr>
+        <w:tc>
+          <w:tcPr>
+            <w:tcW w:w="9062" w:type="dxa"/>
+          </w:tcPr>
+          <w:p>
+            <w:pPr>
+              <w:pStyle w:val="Loendilik"/>
+              <w:ind w:left="0"/>
+            </w:pPr>
+            <w:proofErr w:type="spellStart"/>
+            <w:r>
+              <w:t>You</w:t>
+            </w:r>
+            <w:proofErr w:type="spellEnd"/>
+            <w:r>
+              <w:t xml:space="preserve"> have </w:t>
+            </w:r>
+            <w:proofErr w:type="spellStart"/>
+            <w:r>
+              <w:t>fallen</w:t>
+            </w:r>
+            <w:proofErr w:type="spellEnd"/>
+            <w:r>
+              <w:t xml:space="preserve"> </w:t>
+            </w:r>
+            <w:proofErr w:type="spellStart"/>
+            <w:r>
+              <w:t>down</w:t>
+            </w:r>
+            <w:proofErr w:type="spellEnd"/>
+            <w:r>
+              <w:t xml:space="preserve"> a </w:t>
+            </w:r>
+            <w:proofErr w:type="spellStart"/>
+            <w:r>
+              <w:t>hole</w:t>
+            </w:r>
+            <w:proofErr w:type="spellEnd"/>
+            <w:r>
+              <w:t xml:space="preserve"> and have </w:t>
+            </w:r>
+            <w:proofErr w:type="spellStart"/>
+            <w:r>
+              <w:t>appeared</w:t>
+            </w:r>
+            <w:proofErr w:type="spellEnd"/>
+            <w:r>
+              <w:t xml:space="preserve"> in </w:t>
+            </w:r>
+            <w:proofErr w:type="spellStart"/>
+            <w:r>
+              <w:t>an</w:t>
+            </w:r>
+            <w:proofErr w:type="spellEnd"/>
+            <w:r>
+              <w:t xml:space="preserve"> </w:t>
+            </w:r>
+            <w:proofErr w:type="spellStart"/>
+            <w:r>
+              <w:t>ancient</w:t>
+            </w:r>
+            <w:proofErr w:type="spellEnd"/>
+            <w:r>
+              <w:t xml:space="preserve"> </w:t>
+            </w:r>
+            <w:proofErr w:type="spellStart"/>
+            <w:r>
+              <w:t>temple</w:t>
+            </w:r>
+            <w:proofErr w:type="spellEnd"/>
+            <w:r>
+              <w:t xml:space="preserve"> of </w:t>
+            </w:r>
+            <w:proofErr w:type="spellStart"/>
+            <w:r>
+              <w:t>magic</w:t>
+            </w:r>
+            <w:proofErr w:type="spellEnd"/>
+            <w:r>
+              <w:t xml:space="preserve"> </w:t>
+            </w:r>
+            <w:proofErr w:type="spellStart"/>
+            <w:r>
+              <w:t>gunsmiths</w:t>
+            </w:r>
+            <w:proofErr w:type="spellEnd"/>
+            <w:r>
+              <w:t xml:space="preserve">, </w:t>
+            </w:r>
+            <w:proofErr w:type="spellStart"/>
+            <w:r>
+              <w:t>from</w:t>
+            </w:r>
+            <w:proofErr w:type="spellEnd"/>
+            <w:r>
+              <w:t xml:space="preserve"> </w:t>
+            </w:r>
+            <w:proofErr w:type="spellStart"/>
+            <w:r>
+              <w:t>your</w:t>
+            </w:r>
+            <w:proofErr w:type="spellEnd"/>
+            <w:r>
+              <w:t xml:space="preserve"> </w:t>
+            </w:r>
+            <w:proofErr w:type="spellStart"/>
+            <w:r>
+              <w:t>guess</w:t>
+            </w:r>
+            <w:proofErr w:type="spellEnd"/>
+            <w:r>
+              <w:t>.</w:t>
+            </w:r>
+          </w:p>
+        </w:tc>
+      </w:tr>
+      <w:tr>
+        <w:tc>
+          <w:tcPr>
+            <w:tcW w:w="9062" w:type="dxa"/>
+          </w:tcPr>
+          <w:p>
+            <w:pPr>
+              <w:pStyle w:val="Loendilik"/>
+              <w:ind w:left="0"/>
+            </w:pPr>
+            <w:r>
+              <w:t>&lt;</w:t>
+            </w:r>
+            <w:proofErr w:type="spellStart"/>
+            <w:r>
+              <w:t>Explore</w:t>
+            </w:r>
+            <w:proofErr w:type="spellEnd"/>
+            <w:r>
+              <w:t xml:space="preserve"> </w:t>
+            </w:r>
+            <w:proofErr w:type="spellStart"/>
+            <w:r>
+              <w:t>it</w:t>
+            </w:r>
+            <w:proofErr w:type="spellEnd"/>
+            <w:r>
+              <w:t>&gt;</w:t>
+            </w:r>
+          </w:p>
+          <w:p>
+            <w:pPr>
+              <w:pStyle w:val="Loendilik"/>
+              <w:ind w:left="0"/>
+            </w:pPr>
+            <w:r>
+              <w:t>&lt;</w:t>
+            </w:r>
+            <w:proofErr w:type="spellStart"/>
+            <w:r>
+              <w:t>Use</w:t>
+            </w:r>
+            <w:proofErr w:type="spellEnd"/>
+            <w:r>
+              <w:t xml:space="preserve"> (</w:t>
+            </w:r>
+            <w:proofErr w:type="spellStart"/>
+            <w:r>
+              <w:t>Item</w:t>
+            </w:r>
+            <w:proofErr w:type="spellEnd"/>
+            <w:r>
+              <w:t xml:space="preserve"> </w:t>
+            </w:r>
+            <w:proofErr w:type="spellStart"/>
+            <w:r>
+              <w:t>name</w:t>
+            </w:r>
+            <w:proofErr w:type="spellEnd"/>
+            <w:r>
+              <w:t xml:space="preserve">) </w:t>
+            </w:r>
+            <w:proofErr w:type="spellStart"/>
+            <w:r>
+              <w:t>to</w:t>
+            </w:r>
+            <w:proofErr w:type="spellEnd"/>
+            <w:r>
+              <w:t xml:space="preserve"> </w:t>
+            </w:r>
+            <w:proofErr w:type="spellStart"/>
+            <w:r>
+              <w:t>escape</w:t>
+            </w:r>
+            <w:proofErr w:type="spellEnd"/>
+            <w:r>
+              <w:t>&gt;</w:t>
+            </w:r>
+          </w:p>
+          <w:p>
+            <w:pPr>
+              <w:pStyle w:val="Loendilik"/>
+              <w:ind w:left="0"/>
+            </w:pPr>
+            <w:r>
+              <w:t>&lt;</w:t>
+            </w:r>
+            <w:proofErr w:type="spellStart"/>
+            <w:r>
+              <w:t>Yell</w:t>
+            </w:r>
+            <w:proofErr w:type="spellEnd"/>
+            <w:r>
+              <w:t xml:space="preserve"> </w:t>
+            </w:r>
+            <w:proofErr w:type="spellStart"/>
+            <w:r>
+              <w:t>out</w:t>
+            </w:r>
+            <w:proofErr w:type="spellEnd"/>
+            <w:r>
+              <w:t xml:space="preserve"> a </w:t>
+            </w:r>
+            <w:proofErr w:type="spellStart"/>
+            <w:r>
+              <w:t>cry</w:t>
+            </w:r>
+            <w:proofErr w:type="spellEnd"/>
+            <w:r>
+              <w:t xml:space="preserve"> </w:t>
+            </w:r>
+            <w:proofErr w:type="spellStart"/>
+            <w:r>
+              <w:t>for</w:t>
+            </w:r>
+            <w:proofErr w:type="spellEnd"/>
+            <w:r>
+              <w:t xml:space="preserve"> </w:t>
+            </w:r>
+            <w:proofErr w:type="spellStart"/>
+            <w:r>
+              <w:t>help</w:t>
+            </w:r>
+            <w:proofErr w:type="spellEnd"/>
+            <w:r>
+              <w:t>&gt;</w:t>
+            </w:r>
+          </w:p>
+        </w:tc>
+      </w:tr>
+    </w:tbl>
+    <w:p>
+      <w:pPr>
+        <w:pStyle w:val="Loendilik"/>
+        <w:numPr>
+          <w:ilvl w:val="4"/>
+          <w:numId w:val="3"/>
+        </w:numPr>
+      </w:pPr>
+      <w:proofErr w:type="spellStart"/>
+      <w:r>
+        <w:t>You</w:t>
+      </w:r>
+      <w:proofErr w:type="spellEnd"/>
+      <w:r>
+        <w:t xml:space="preserve"> </w:t>
+      </w:r>
+      <w:proofErr w:type="spellStart"/>
+      <w:r>
+        <w:t>go</w:t>
+      </w:r>
+      <w:proofErr w:type="spellEnd"/>
+      <w:r>
+        <w:t xml:space="preserve"> </w:t>
+      </w:r>
+      <w:proofErr w:type="spellStart"/>
+      <w:r>
+        <w:t>explor</w:t>
+      </w:r>
+      <w:r>
+        <w:t>e</w:t>
+      </w:r>
+      <w:proofErr w:type="spellEnd"/>
+      <w:r>
+        <w:t xml:space="preserve"> </w:t>
+      </w:r>
+      <w:proofErr w:type="spellStart"/>
+      <w:r>
+        <w:t>it</w:t>
+      </w:r>
+      <w:proofErr w:type="spellEnd"/>
+      <w:r>
+        <w:t xml:space="preserve"> and </w:t>
+      </w:r>
+      <w:proofErr w:type="spellStart"/>
+      <w:r>
+        <w:t>the</w:t>
+      </w:r>
+      <w:proofErr w:type="spellEnd"/>
+      <w:r>
+        <w:t xml:space="preserve"> </w:t>
+      </w:r>
+      <w:proofErr w:type="spellStart"/>
+      <w:r>
+        <w:t>story</w:t>
+      </w:r>
+      <w:proofErr w:type="spellEnd"/>
+      <w:r>
+        <w:t xml:space="preserve"> </w:t>
+      </w:r>
+      <w:proofErr w:type="spellStart"/>
+      <w:r>
+        <w:t>unfolds</w:t>
+      </w:r>
+      <w:proofErr w:type="spellEnd"/>
+      <w:r>
+        <w:t xml:space="preserve"> </w:t>
+      </w:r>
+      <w:proofErr w:type="spellStart"/>
+      <w:r>
+        <w:t>abit</w:t>
+      </w:r>
+      <w:proofErr w:type="spellEnd"/>
+      <w:r>
+        <w:t xml:space="preserve"> </w:t>
+      </w:r>
+      <w:proofErr w:type="spellStart"/>
+      <w:r>
+        <w:t>more</w:t>
+      </w:r>
+      <w:proofErr w:type="spellEnd"/>
+      <w:r>
+        <w:t>.</w:t>
+      </w:r>
+    </w:p>
+    <w:p>
+      <w:pPr>
+        <w:pStyle w:val="Loendilik"/>
+        <w:numPr>
+          <w:ilvl w:val="4"/>
+          <w:numId w:val="3"/>
+        </w:numPr>
+      </w:pPr>
+      <w:proofErr w:type="spellStart"/>
+      <w:r>
+        <w:t>Depending</w:t>
+      </w:r>
+      <w:proofErr w:type="spellEnd"/>
+      <w:r>
+        <w:t xml:space="preserve"> on </w:t>
+      </w:r>
+      <w:proofErr w:type="spellStart"/>
+      <w:r>
+        <w:t>the</w:t>
+      </w:r>
+      <w:proofErr w:type="spellEnd"/>
+      <w:r>
+        <w:t xml:space="preserve"> </w:t>
+      </w:r>
+      <w:proofErr w:type="spellStart"/>
+      <w:r>
+        <w:t>item</w:t>
+      </w:r>
+      <w:proofErr w:type="spellEnd"/>
+      <w:r>
+        <w:t xml:space="preserve"> </w:t>
+      </w:r>
+      <w:proofErr w:type="spellStart"/>
+      <w:r>
+        <w:t>you</w:t>
+      </w:r>
+      <w:proofErr w:type="spellEnd"/>
+      <w:r>
+        <w:t xml:space="preserve"> </w:t>
+      </w:r>
+      <w:proofErr w:type="spellStart"/>
+      <w:r>
+        <w:t>use</w:t>
+      </w:r>
+      <w:proofErr w:type="spellEnd"/>
+      <w:r>
+        <w:t xml:space="preserve"> </w:t>
+      </w:r>
+      <w:proofErr w:type="spellStart"/>
+      <w:r>
+        <w:t>diffrent</w:t>
+      </w:r>
+      <w:proofErr w:type="spellEnd"/>
+      <w:r>
+        <w:t xml:space="preserve"> </w:t>
+      </w:r>
+      <w:proofErr w:type="spellStart"/>
+      <w:r>
+        <w:t>types</w:t>
+      </w:r>
+      <w:proofErr w:type="spellEnd"/>
+      <w:r>
+        <w:t xml:space="preserve"> of </w:t>
+      </w:r>
+      <w:proofErr w:type="spellStart"/>
+      <w:r>
+        <w:t>texts</w:t>
+      </w:r>
+      <w:proofErr w:type="spellEnd"/>
+      <w:r>
+        <w:t xml:space="preserve"> </w:t>
+      </w:r>
+      <w:proofErr w:type="spellStart"/>
+      <w:r>
+        <w:t>appear</w:t>
+      </w:r>
+      <w:proofErr w:type="spellEnd"/>
+      <w:r>
+        <w:t xml:space="preserve"> </w:t>
+      </w:r>
+      <w:proofErr w:type="spellStart"/>
+      <w:r>
+        <w:t>but</w:t>
+      </w:r>
+      <w:proofErr w:type="spellEnd"/>
+      <w:r>
+        <w:t xml:space="preserve"> </w:t>
+      </w:r>
+      <w:proofErr w:type="spellStart"/>
+      <w:r>
+        <w:t>depending</w:t>
+      </w:r>
+      <w:proofErr w:type="spellEnd"/>
+      <w:r>
+        <w:t xml:space="preserve"> on </w:t>
+      </w:r>
+      <w:proofErr w:type="spellStart"/>
+      <w:r>
+        <w:t>the</w:t>
+      </w:r>
+      <w:proofErr w:type="spellEnd"/>
+      <w:r>
+        <w:t xml:space="preserve"> </w:t>
+      </w:r>
+      <w:proofErr w:type="spellStart"/>
+      <w:r>
+        <w:t>item</w:t>
+      </w:r>
+      <w:proofErr w:type="spellEnd"/>
+      <w:r>
+        <w:t xml:space="preserve"> </w:t>
+      </w:r>
+      <w:proofErr w:type="spellStart"/>
+      <w:r>
+        <w:t>if</w:t>
+      </w:r>
+      <w:proofErr w:type="spellEnd"/>
+      <w:r>
+        <w:t xml:space="preserve"> </w:t>
+      </w:r>
+      <w:proofErr w:type="spellStart"/>
+      <w:r>
+        <w:t>its</w:t>
+      </w:r>
+      <w:proofErr w:type="spellEnd"/>
+      <w:r>
+        <w:t xml:space="preserve"> a </w:t>
+      </w:r>
+      <w:proofErr w:type="spellStart"/>
+      <w:r>
+        <w:t>consumable</w:t>
+      </w:r>
+      <w:proofErr w:type="spellEnd"/>
+      <w:r>
+        <w:t xml:space="preserve"> </w:t>
+      </w:r>
+      <w:proofErr w:type="spellStart"/>
+      <w:r>
+        <w:t>or</w:t>
+      </w:r>
+      <w:proofErr w:type="spellEnd"/>
+      <w:r>
+        <w:t xml:space="preserve"> </w:t>
+      </w:r>
+      <w:proofErr w:type="spellStart"/>
+      <w:r>
+        <w:t>it</w:t>
+      </w:r>
+      <w:proofErr w:type="spellEnd"/>
+      <w:r>
+        <w:t xml:space="preserve"> </w:t>
+      </w:r>
+      <w:proofErr w:type="spellStart"/>
+      <w:r>
+        <w:t>they</w:t>
+      </w:r>
+      <w:proofErr w:type="spellEnd"/>
+      <w:r>
+        <w:t xml:space="preserve"> fail a </w:t>
+      </w:r>
+      <w:proofErr w:type="spellStart"/>
+      <w:r>
+        <w:t>random</w:t>
+      </w:r>
+      <w:proofErr w:type="spellEnd"/>
+      <w:r>
+        <w:t xml:space="preserve"> </w:t>
+      </w:r>
+      <w:proofErr w:type="spellStart"/>
+      <w:r>
+        <w:t>luck</w:t>
+      </w:r>
+      <w:proofErr w:type="spellEnd"/>
+      <w:r>
+        <w:t xml:space="preserve"> </w:t>
+      </w:r>
+      <w:proofErr w:type="spellStart"/>
+      <w:r>
+        <w:t>check</w:t>
+      </w:r>
+      <w:proofErr w:type="spellEnd"/>
+      <w:r>
+        <w:t xml:space="preserve"> </w:t>
+      </w:r>
+      <w:proofErr w:type="spellStart"/>
+      <w:r>
+        <w:t>they</w:t>
+      </w:r>
+      <w:proofErr w:type="spellEnd"/>
+      <w:r>
+        <w:t xml:space="preserve"> </w:t>
+      </w:r>
+      <w:proofErr w:type="spellStart"/>
+      <w:r>
+        <w:t>mey</w:t>
+      </w:r>
+      <w:proofErr w:type="spellEnd"/>
+      <w:r>
+        <w:t xml:space="preserve"> </w:t>
+      </w:r>
+      <w:proofErr w:type="spellStart"/>
+      <w:r>
+        <w:t>lose</w:t>
+      </w:r>
+      <w:proofErr w:type="spellEnd"/>
+      <w:r>
+        <w:t xml:space="preserve"> </w:t>
+      </w:r>
+      <w:proofErr w:type="spellStart"/>
+      <w:r>
+        <w:t>it</w:t>
+      </w:r>
+      <w:proofErr w:type="spellEnd"/>
+      <w:r>
+        <w:t xml:space="preserve"> </w:t>
+      </w:r>
+      <w:proofErr w:type="spellStart"/>
+      <w:r>
+        <w:t>or</w:t>
+      </w:r>
+      <w:proofErr w:type="spellEnd"/>
+      <w:r>
+        <w:t xml:space="preserve"> </w:t>
+      </w:r>
+      <w:proofErr w:type="spellStart"/>
+      <w:r>
+        <w:t>even</w:t>
+      </w:r>
+      <w:proofErr w:type="spellEnd"/>
+      <w:r>
+        <w:t xml:space="preserve"> </w:t>
+      </w:r>
+      <w:proofErr w:type="spellStart"/>
+      <w:r>
+        <w:t>lose</w:t>
+      </w:r>
+      <w:proofErr w:type="spellEnd"/>
+      <w:r>
+        <w:t xml:space="preserve"> </w:t>
+      </w:r>
+      <w:proofErr w:type="spellStart"/>
+      <w:r>
+        <w:t>it</w:t>
+      </w:r>
+      <w:proofErr w:type="spellEnd"/>
+      <w:r>
+        <w:t xml:space="preserve"> and just fail.</w:t>
+      </w:r>
+    </w:p>
+    <w:p>
+      <w:pPr>
+        <w:pStyle w:val="Loendilik"/>
+        <w:numPr>
+          <w:ilvl w:val="4"/>
+          <w:numId w:val="3"/>
+        </w:numPr>
+      </w:pPr>
+      <w:proofErr w:type="spellStart"/>
+      <w:r>
+        <w:t>Dice</w:t>
+      </w:r>
+      <w:proofErr w:type="spellEnd"/>
+      <w:r>
+        <w:t xml:space="preserve"> roll tuleb</w:t>
+      </w:r>
+      <w:r>
+        <w:t xml:space="preserve"> ja seda määrates</w:t>
+      </w:r>
+      <w:r>
+        <w:t xml:space="preserve"> sina võid 1. jääda auku et mitte keegi ei kuule sind 2. keegi kuulis ja tuleb aitab sind või 3. keegi tuli ja kasutab sinu situatsiooni et </w:t>
+      </w:r>
+      <w:proofErr w:type="spellStart"/>
+      <w:r>
+        <w:t>rünnada</w:t>
+      </w:r>
+      <w:proofErr w:type="spellEnd"/>
+      <w:r>
+        <w:t xml:space="preserve"> või nõuda sinult raha</w:t>
+      </w:r>
+      <w:r>
+        <w:t>.</w:t>
+      </w:r>
     </w:p>
     <w:p>
       <w:pPr>
@@ -1074,6 +2166,178 @@
 <file path=word/numbering.xml><?xml version="1.0" encoding="utf-8"?>
 <w:numbering xmlns:wpc="http://schemas.microsoft.com/office/word/2010/wordprocessingCanvas" xmlns:cx="http://schemas.microsoft.com/office/drawing/2014/chartex" xmlns:cx1="http://schemas.microsoft.com/office/drawing/2015/9/8/chartex" xmlns:cx2="http://schemas.microsoft.com/office/drawing/2015/10/21/chartex" xmlns:cx3="http://schemas.microsoft.com/office/drawing/2016/5/9/chartex" xmlns:cx4="http://schemas.microsoft.com/office/drawing/2016/5/10/chartex" xmlns:cx5="http://schemas.microsoft.com/office/drawing/2016/5/11/chartex" xmlns:cx6="http://schemas.microsoft.com/office/drawing/2016/5/12/chartex" xmlns:cx7="http://schemas.microsoft.com/office/drawing/2016/5/13/chartex" xmlns:cx8="http://schemas.microsoft.com/office/drawing/2016/5/14/chartex" xmlns:mc="http://schemas.openxmlformats.org/markup-compatibility/2006" xmlns:aink="http://schemas.microsoft.com/office/drawing/2016/ink" xmlns:am3d="http://schemas.microsoft.com/office/drawing/2017/model3d" xmlns:o="urn:schemas-microsoft-com:office:office" xmlns:r="http://schemas.openxmlformats.org/officeDocument/2006/relationships" xmlns:m="http://schemas.openxmlformats.org/officeDocument/2006/math" xmlns:v="urn:schemas-microsoft-com:vml" xmlns:wp14="http://schemas.microsoft.com/office/word/2010/wordprocessingDrawing" xmlns:wp="http://schemas.openxmlformats.org/drawingml/2006/wordprocessingDrawing" xmlns:w10="urn:schemas-microsoft-com:office:word" xmlns:w="http://schemas.openxmlformats.org/wordprocessingml/2006/main" xmlns:w14="http://schemas.microsoft.com/office/word/2010/wordml" xmlns:w15="http://schemas.microsoft.com/office/word/2012/wordml" xmlns:w16cex="http://schemas.microsoft.com/office/word/2018/wordml/cex" xmlns:w16cid="http://schemas.microsoft.com/office/word/2016/wordml/cid" xmlns:w16="http://schemas.microsoft.com/office/word/2018/wordml" xmlns:w16sdtdh="http://schemas.microsoft.com/office/word/2020/wordml/sdtdatahash" xmlns:w16se="http://schemas.microsoft.com/office/word/2015/wordml/symex" xmlns:wpg="http://schemas.microsoft.com/office/word/2010/wordprocessingGroup" xmlns:wpi="http://schemas.microsoft.com/office/word/2010/wordprocessingInk" xmlns:wne="http://schemas.microsoft.com/office/word/2006/wordml" xmlns:wps="http://schemas.microsoft.com/office/word/2010/wordprocessingShape" mc:Ignorable="w14 w15 w16se w16cid w16 w16cex w16sdtdh wp14">
   <w:abstractNum w:abstractNumId="0" w15:restartNumberingAfterBreak="0">
+    <w:nsid w:val="2298581C"/>
+    <w:multiLevelType w:val="multilevel"/>
+    <w:tmpl w:val="A2226FB2"/>
+    <w:lvl w:ilvl="0">
+      <w:start w:val="1"/>
+      <w:numFmt w:val="decimal"/>
+      <w:lvlText w:val="%1)"/>
+      <w:lvlJc w:val="left"/>
+      <w:pPr>
+        <w:ind w:left="360" w:hanging="360"/>
+      </w:pPr>
+    </w:lvl>
+    <w:lvl w:ilvl="1">
+      <w:start w:val="1"/>
+      <w:numFmt w:val="lowerLetter"/>
+      <w:lvlText w:val="%2)"/>
+      <w:lvlJc w:val="left"/>
+      <w:pPr>
+        <w:ind w:left="720" w:hanging="360"/>
+      </w:pPr>
+    </w:lvl>
+    <w:lvl w:ilvl="2">
+      <w:start w:val="1"/>
+      <w:numFmt w:val="lowerRoman"/>
+      <w:lvlText w:val="%3)"/>
+      <w:lvlJc w:val="left"/>
+      <w:pPr>
+        <w:ind w:left="1080" w:hanging="360"/>
+      </w:pPr>
+    </w:lvl>
+    <w:lvl w:ilvl="3">
+      <w:start w:val="1"/>
+      <w:numFmt w:val="decimal"/>
+      <w:lvlText w:val="(%4)"/>
+      <w:lvlJc w:val="left"/>
+      <w:pPr>
+        <w:ind w:left="1440" w:hanging="360"/>
+      </w:pPr>
+    </w:lvl>
+    <w:lvl w:ilvl="4">
+      <w:start w:val="1"/>
+      <w:numFmt w:val="lowerLetter"/>
+      <w:lvlText w:val="(%5)"/>
+      <w:lvlJc w:val="left"/>
+      <w:pPr>
+        <w:ind w:left="1800" w:hanging="360"/>
+      </w:pPr>
+    </w:lvl>
+    <w:lvl w:ilvl="5">
+      <w:start w:val="1"/>
+      <w:numFmt w:val="lowerRoman"/>
+      <w:lvlText w:val="(%6)"/>
+      <w:lvlJc w:val="left"/>
+      <w:pPr>
+        <w:ind w:left="2160" w:hanging="360"/>
+      </w:pPr>
+    </w:lvl>
+    <w:lvl w:ilvl="6">
+      <w:start w:val="1"/>
+      <w:numFmt w:val="lowerLetter"/>
+      <w:lvlText w:val="%7."/>
+      <w:lvlJc w:val="left"/>
+      <w:pPr>
+        <w:ind w:left="2520" w:hanging="360"/>
+      </w:pPr>
+    </w:lvl>
+    <w:lvl w:ilvl="7">
+      <w:start w:val="1"/>
+      <w:numFmt w:val="lowerLetter"/>
+      <w:lvlText w:val="%8."/>
+      <w:lvlJc w:val="left"/>
+      <w:pPr>
+        <w:ind w:left="2880" w:hanging="360"/>
+      </w:pPr>
+    </w:lvl>
+    <w:lvl w:ilvl="8">
+      <w:start w:val="1"/>
+      <w:numFmt w:val="lowerRoman"/>
+      <w:lvlText w:val="%9."/>
+      <w:lvlJc w:val="left"/>
+      <w:pPr>
+        <w:ind w:left="3240" w:hanging="360"/>
+      </w:pPr>
+    </w:lvl>
+  </w:abstractNum>
+  <w:abstractNum w:abstractNumId="1" w15:restartNumberingAfterBreak="0">
+    <w:nsid w:val="2A135271"/>
+    <w:multiLevelType w:val="multilevel"/>
+    <w:tmpl w:val="0425001D"/>
+    <w:lvl w:ilvl="0">
+      <w:start w:val="1"/>
+      <w:numFmt w:val="decimal"/>
+      <w:lvlText w:val="%1)"/>
+      <w:lvlJc w:val="left"/>
+      <w:pPr>
+        <w:ind w:left="1776" w:hanging="360"/>
+      </w:pPr>
+    </w:lvl>
+    <w:lvl w:ilvl="1">
+      <w:start w:val="1"/>
+      <w:numFmt w:val="lowerLetter"/>
+      <w:lvlText w:val="%2)"/>
+      <w:lvlJc w:val="left"/>
+      <w:pPr>
+        <w:ind w:left="2136" w:hanging="360"/>
+      </w:pPr>
+    </w:lvl>
+    <w:lvl w:ilvl="2">
+      <w:start w:val="1"/>
+      <w:numFmt w:val="lowerRoman"/>
+      <w:lvlText w:val="%3)"/>
+      <w:lvlJc w:val="left"/>
+      <w:pPr>
+        <w:ind w:left="2496" w:hanging="360"/>
+      </w:pPr>
+    </w:lvl>
+    <w:lvl w:ilvl="3">
+      <w:start w:val="1"/>
+      <w:numFmt w:val="decimal"/>
+      <w:lvlText w:val="(%4)"/>
+      <w:lvlJc w:val="left"/>
+      <w:pPr>
+        <w:ind w:left="2856" w:hanging="360"/>
+      </w:pPr>
+    </w:lvl>
+    <w:lvl w:ilvl="4">
+      <w:start w:val="1"/>
+      <w:numFmt w:val="lowerLetter"/>
+      <w:lvlText w:val="(%5)"/>
+      <w:lvlJc w:val="left"/>
+      <w:pPr>
+        <w:ind w:left="3216" w:hanging="360"/>
+      </w:pPr>
+    </w:lvl>
+    <w:lvl w:ilvl="5">
+      <w:start w:val="1"/>
+      <w:numFmt w:val="lowerRoman"/>
+      <w:lvlText w:val="(%6)"/>
+      <w:lvlJc w:val="left"/>
+      <w:pPr>
+        <w:ind w:left="3576" w:hanging="360"/>
+      </w:pPr>
+    </w:lvl>
+    <w:lvl w:ilvl="6">
+      <w:start w:val="1"/>
+      <w:numFmt w:val="decimal"/>
+      <w:lvlText w:val="%7."/>
+      <w:lvlJc w:val="left"/>
+      <w:pPr>
+        <w:ind w:left="3936" w:hanging="360"/>
+      </w:pPr>
+    </w:lvl>
+    <w:lvl w:ilvl="7">
+      <w:start w:val="1"/>
+      <w:numFmt w:val="lowerLetter"/>
+      <w:lvlText w:val="%8."/>
+      <w:lvlJc w:val="left"/>
+      <w:pPr>
+        <w:ind w:left="4296" w:hanging="360"/>
+      </w:pPr>
+    </w:lvl>
+    <w:lvl w:ilvl="8">
+      <w:start w:val="1"/>
+      <w:numFmt w:val="lowerRoman"/>
+      <w:lvlText w:val="%9."/>
+      <w:lvlJc w:val="left"/>
+      <w:pPr>
+        <w:ind w:left="4656" w:hanging="360"/>
+      </w:pPr>
+    </w:lvl>
+  </w:abstractNum>
+  <w:abstractNum w:abstractNumId="2" w15:restartNumberingAfterBreak="0">
     <w:nsid w:val="2C933F41"/>
     <w:multiLevelType w:val="hybridMultilevel"/>
     <w:tmpl w:val="AB0C95D0"/>
@@ -1186,7 +2450,93 @@
       </w:rPr>
     </w:lvl>
   </w:abstractNum>
-  <w:abstractNum w:abstractNumId="1" w15:restartNumberingAfterBreak="0">
+  <w:abstractNum w:abstractNumId="3" w15:restartNumberingAfterBreak="0">
+    <w:nsid w:val="34BD6E6F"/>
+    <w:multiLevelType w:val="hybridMultilevel"/>
+    <w:tmpl w:val="E3D4FCA0"/>
+    <w:lvl w:ilvl="0" w:tplc="0425000F">
+      <w:start w:val="1"/>
+      <w:numFmt w:val="decimal"/>
+      <w:lvlText w:val="%1."/>
+      <w:lvlJc w:val="left"/>
+      <w:pPr>
+        <w:ind w:left="720" w:hanging="360"/>
+      </w:pPr>
+    </w:lvl>
+    <w:lvl w:ilvl="1" w:tplc="04250019">
+      <w:start w:val="1"/>
+      <w:numFmt w:val="lowerLetter"/>
+      <w:lvlText w:val="%2."/>
+      <w:lvlJc w:val="left"/>
+      <w:pPr>
+        <w:ind w:left="1440" w:hanging="360"/>
+      </w:pPr>
+    </w:lvl>
+    <w:lvl w:ilvl="2" w:tplc="0425001B">
+      <w:start w:val="1"/>
+      <w:numFmt w:val="lowerRoman"/>
+      <w:lvlText w:val="%3."/>
+      <w:lvlJc w:val="right"/>
+      <w:pPr>
+        <w:ind w:left="2160" w:hanging="180"/>
+      </w:pPr>
+    </w:lvl>
+    <w:lvl w:ilvl="3" w:tplc="0425000F">
+      <w:start w:val="1"/>
+      <w:numFmt w:val="decimal"/>
+      <w:lvlText w:val="%4."/>
+      <w:lvlJc w:val="left"/>
+      <w:pPr>
+        <w:ind w:left="2880" w:hanging="360"/>
+      </w:pPr>
+    </w:lvl>
+    <w:lvl w:ilvl="4" w:tplc="04250019">
+      <w:start w:val="1"/>
+      <w:numFmt w:val="lowerLetter"/>
+      <w:lvlText w:val="%5."/>
+      <w:lvlJc w:val="left"/>
+      <w:pPr>
+        <w:ind w:left="3600" w:hanging="360"/>
+      </w:pPr>
+    </w:lvl>
+    <w:lvl w:ilvl="5" w:tplc="0425001B" w:tentative="1">
+      <w:start w:val="1"/>
+      <w:numFmt w:val="lowerRoman"/>
+      <w:lvlText w:val="%6."/>
+      <w:lvlJc w:val="right"/>
+      <w:pPr>
+        <w:ind w:left="4320" w:hanging="180"/>
+      </w:pPr>
+    </w:lvl>
+    <w:lvl w:ilvl="6" w:tplc="0425000F" w:tentative="1">
+      <w:start w:val="1"/>
+      <w:numFmt w:val="decimal"/>
+      <w:lvlText w:val="%7."/>
+      <w:lvlJc w:val="left"/>
+      <w:pPr>
+        <w:ind w:left="5040" w:hanging="360"/>
+      </w:pPr>
+    </w:lvl>
+    <w:lvl w:ilvl="7" w:tplc="04250019" w:tentative="1">
+      <w:start w:val="1"/>
+      <w:numFmt w:val="lowerLetter"/>
+      <w:lvlText w:val="%8."/>
+      <w:lvlJc w:val="left"/>
+      <w:pPr>
+        <w:ind w:left="5760" w:hanging="360"/>
+      </w:pPr>
+    </w:lvl>
+    <w:lvl w:ilvl="8" w:tplc="0425001B" w:tentative="1">
+      <w:start w:val="1"/>
+      <w:numFmt w:val="lowerRoman"/>
+      <w:lvlText w:val="%9."/>
+      <w:lvlJc w:val="right"/>
+      <w:pPr>
+        <w:ind w:left="6480" w:hanging="180"/>
+      </w:pPr>
+    </w:lvl>
+  </w:abstractNum>
+  <w:abstractNum w:abstractNumId="4" w15:restartNumberingAfterBreak="0">
     <w:nsid w:val="39997088"/>
     <w:multiLevelType w:val="hybridMultilevel"/>
     <w:tmpl w:val="9EE64826"/>
@@ -1299,7 +2649,7 @@
       </w:rPr>
     </w:lvl>
   </w:abstractNum>
-  <w:abstractNum w:abstractNumId="2" w15:restartNumberingAfterBreak="0">
+  <w:abstractNum w:abstractNumId="5" w15:restartNumberingAfterBreak="0">
     <w:nsid w:val="408D2AA0"/>
     <w:multiLevelType w:val="hybridMultilevel"/>
     <w:tmpl w:val="CBF05898"/>
@@ -1412,10 +2762,10 @@
       </w:rPr>
     </w:lvl>
   </w:abstractNum>
-  <w:abstractNum w:abstractNumId="3" w15:restartNumberingAfterBreak="0">
+  <w:abstractNum w:abstractNumId="6" w15:restartNumberingAfterBreak="0">
     <w:nsid w:val="49225307"/>
     <w:multiLevelType w:val="hybridMultilevel"/>
-    <w:tmpl w:val="E3FCFB5A"/>
+    <w:tmpl w:val="5DC6E936"/>
     <w:lvl w:ilvl="0" w:tplc="04250017">
       <w:start w:val="1"/>
       <w:numFmt w:val="lowerLetter"/>
@@ -1425,7 +2775,7 @@
         <w:ind w:left="1440" w:hanging="360"/>
       </w:pPr>
     </w:lvl>
-    <w:lvl w:ilvl="1" w:tplc="04250019" w:tentative="1">
+    <w:lvl w:ilvl="1" w:tplc="04250019">
       <w:start w:val="1"/>
       <w:numFmt w:val="lowerLetter"/>
       <w:lvlText w:val="%2."/>
@@ -1434,7 +2784,7 @@
         <w:ind w:left="2160" w:hanging="360"/>
       </w:pPr>
     </w:lvl>
-    <w:lvl w:ilvl="2" w:tplc="0425001B" w:tentative="1">
+    <w:lvl w:ilvl="2" w:tplc="7B54C5E0">
       <w:start w:val="1"/>
       <w:numFmt w:val="lowerRoman"/>
       <w:lvlText w:val="%3."/>
@@ -1442,8 +2792,11 @@
       <w:pPr>
         <w:ind w:left="2880" w:hanging="180"/>
       </w:pPr>
-    </w:lvl>
-    <w:lvl w:ilvl="3" w:tplc="0425000F" w:tentative="1">
+      <w:rPr>
+        <w:color w:val="auto"/>
+      </w:rPr>
+    </w:lvl>
+    <w:lvl w:ilvl="3" w:tplc="0425000F">
       <w:start w:val="1"/>
       <w:numFmt w:val="decimal"/>
       <w:lvlText w:val="%4."/>
@@ -1452,7 +2805,7 @@
         <w:ind w:left="3600" w:hanging="360"/>
       </w:pPr>
     </w:lvl>
-    <w:lvl w:ilvl="4" w:tplc="04250019" w:tentative="1">
+    <w:lvl w:ilvl="4" w:tplc="04250019">
       <w:start w:val="1"/>
       <w:numFmt w:val="lowerLetter"/>
       <w:lvlText w:val="%5."/>
@@ -1498,16 +2851,230 @@
       </w:pPr>
     </w:lvl>
   </w:abstractNum>
+  <w:abstractNum w:abstractNumId="7" w15:restartNumberingAfterBreak="0">
+    <w:nsid w:val="6165287D"/>
+    <w:multiLevelType w:val="hybridMultilevel"/>
+    <w:tmpl w:val="E7F42806"/>
+    <w:lvl w:ilvl="0" w:tplc="04250015">
+      <w:start w:val="1"/>
+      <w:numFmt w:val="upperLetter"/>
+      <w:lvlText w:val="%1."/>
+      <w:lvlJc w:val="left"/>
+      <w:pPr>
+        <w:ind w:left="2136" w:hanging="360"/>
+      </w:pPr>
+    </w:lvl>
+    <w:lvl w:ilvl="1" w:tplc="04250019" w:tentative="1">
+      <w:start w:val="1"/>
+      <w:numFmt w:val="lowerLetter"/>
+      <w:lvlText w:val="%2."/>
+      <w:lvlJc w:val="left"/>
+      <w:pPr>
+        <w:ind w:left="2856" w:hanging="360"/>
+      </w:pPr>
+    </w:lvl>
+    <w:lvl w:ilvl="2" w:tplc="0425001B" w:tentative="1">
+      <w:start w:val="1"/>
+      <w:numFmt w:val="lowerRoman"/>
+      <w:lvlText w:val="%3."/>
+      <w:lvlJc w:val="right"/>
+      <w:pPr>
+        <w:ind w:left="3576" w:hanging="180"/>
+      </w:pPr>
+    </w:lvl>
+    <w:lvl w:ilvl="3" w:tplc="0425000F" w:tentative="1">
+      <w:start w:val="1"/>
+      <w:numFmt w:val="decimal"/>
+      <w:lvlText w:val="%4."/>
+      <w:lvlJc w:val="left"/>
+      <w:pPr>
+        <w:ind w:left="4296" w:hanging="360"/>
+      </w:pPr>
+    </w:lvl>
+    <w:lvl w:ilvl="4" w:tplc="04250019" w:tentative="1">
+      <w:start w:val="1"/>
+      <w:numFmt w:val="lowerLetter"/>
+      <w:lvlText w:val="%5."/>
+      <w:lvlJc w:val="left"/>
+      <w:pPr>
+        <w:ind w:left="5016" w:hanging="360"/>
+      </w:pPr>
+    </w:lvl>
+    <w:lvl w:ilvl="5" w:tplc="0425001B" w:tentative="1">
+      <w:start w:val="1"/>
+      <w:numFmt w:val="lowerRoman"/>
+      <w:lvlText w:val="%6."/>
+      <w:lvlJc w:val="right"/>
+      <w:pPr>
+        <w:ind w:left="5736" w:hanging="180"/>
+      </w:pPr>
+    </w:lvl>
+    <w:lvl w:ilvl="6" w:tplc="0425000F" w:tentative="1">
+      <w:start w:val="1"/>
+      <w:numFmt w:val="decimal"/>
+      <w:lvlText w:val="%7."/>
+      <w:lvlJc w:val="left"/>
+      <w:pPr>
+        <w:ind w:left="6456" w:hanging="360"/>
+      </w:pPr>
+    </w:lvl>
+    <w:lvl w:ilvl="7" w:tplc="04250019" w:tentative="1">
+      <w:start w:val="1"/>
+      <w:numFmt w:val="lowerLetter"/>
+      <w:lvlText w:val="%8."/>
+      <w:lvlJc w:val="left"/>
+      <w:pPr>
+        <w:ind w:left="7176" w:hanging="360"/>
+      </w:pPr>
+    </w:lvl>
+    <w:lvl w:ilvl="8" w:tplc="0425001B" w:tentative="1">
+      <w:start w:val="1"/>
+      <w:numFmt w:val="lowerRoman"/>
+      <w:lvlText w:val="%9."/>
+      <w:lvlJc w:val="right"/>
+      <w:pPr>
+        <w:ind w:left="7896" w:hanging="180"/>
+      </w:pPr>
+    </w:lvl>
+  </w:abstractNum>
+  <w:abstractNum w:abstractNumId="8" w15:restartNumberingAfterBreak="0">
+    <w:nsid w:val="72044F27"/>
+    <w:multiLevelType w:val="hybridMultilevel"/>
+    <w:tmpl w:val="FBC8AA90"/>
+    <w:lvl w:ilvl="0" w:tplc="04250001">
+      <w:start w:val="1"/>
+      <w:numFmt w:val="bullet"/>
+      <w:lvlText w:val=""/>
+      <w:lvlJc w:val="left"/>
+      <w:pPr>
+        <w:ind w:left="720" w:hanging="360"/>
+      </w:pPr>
+      <w:rPr>
+        <w:rFonts w:ascii="Symbol" w:hAnsi="Symbol" w:hint="default"/>
+      </w:rPr>
+    </w:lvl>
+    <w:lvl w:ilvl="1" w:tplc="04250003" w:tentative="1">
+      <w:start w:val="1"/>
+      <w:numFmt w:val="bullet"/>
+      <w:lvlText w:val="o"/>
+      <w:lvlJc w:val="left"/>
+      <w:pPr>
+        <w:ind w:left="1440" w:hanging="360"/>
+      </w:pPr>
+      <w:rPr>
+        <w:rFonts w:ascii="Courier New" w:hAnsi="Courier New" w:cs="Courier New" w:hint="default"/>
+      </w:rPr>
+    </w:lvl>
+    <w:lvl w:ilvl="2" w:tplc="04250005" w:tentative="1">
+      <w:start w:val="1"/>
+      <w:numFmt w:val="bullet"/>
+      <w:lvlText w:val=""/>
+      <w:lvlJc w:val="left"/>
+      <w:pPr>
+        <w:ind w:left="2160" w:hanging="360"/>
+      </w:pPr>
+      <w:rPr>
+        <w:rFonts w:ascii="Wingdings" w:hAnsi="Wingdings" w:hint="default"/>
+      </w:rPr>
+    </w:lvl>
+    <w:lvl w:ilvl="3" w:tplc="04250001" w:tentative="1">
+      <w:start w:val="1"/>
+      <w:numFmt w:val="bullet"/>
+      <w:lvlText w:val=""/>
+      <w:lvlJc w:val="left"/>
+      <w:pPr>
+        <w:ind w:left="2880" w:hanging="360"/>
+      </w:pPr>
+      <w:rPr>
+        <w:rFonts w:ascii="Symbol" w:hAnsi="Symbol" w:hint="default"/>
+      </w:rPr>
+    </w:lvl>
+    <w:lvl w:ilvl="4" w:tplc="04250003" w:tentative="1">
+      <w:start w:val="1"/>
+      <w:numFmt w:val="bullet"/>
+      <w:lvlText w:val="o"/>
+      <w:lvlJc w:val="left"/>
+      <w:pPr>
+        <w:ind w:left="3600" w:hanging="360"/>
+      </w:pPr>
+      <w:rPr>
+        <w:rFonts w:ascii="Courier New" w:hAnsi="Courier New" w:cs="Courier New" w:hint="default"/>
+      </w:rPr>
+    </w:lvl>
+    <w:lvl w:ilvl="5" w:tplc="04250005" w:tentative="1">
+      <w:start w:val="1"/>
+      <w:numFmt w:val="bullet"/>
+      <w:lvlText w:val=""/>
+      <w:lvlJc w:val="left"/>
+      <w:pPr>
+        <w:ind w:left="4320" w:hanging="360"/>
+      </w:pPr>
+      <w:rPr>
+        <w:rFonts w:ascii="Wingdings" w:hAnsi="Wingdings" w:hint="default"/>
+      </w:rPr>
+    </w:lvl>
+    <w:lvl w:ilvl="6" w:tplc="04250001" w:tentative="1">
+      <w:start w:val="1"/>
+      <w:numFmt w:val="bullet"/>
+      <w:lvlText w:val=""/>
+      <w:lvlJc w:val="left"/>
+      <w:pPr>
+        <w:ind w:left="5040" w:hanging="360"/>
+      </w:pPr>
+      <w:rPr>
+        <w:rFonts w:ascii="Symbol" w:hAnsi="Symbol" w:hint="default"/>
+      </w:rPr>
+    </w:lvl>
+    <w:lvl w:ilvl="7" w:tplc="04250003" w:tentative="1">
+      <w:start w:val="1"/>
+      <w:numFmt w:val="bullet"/>
+      <w:lvlText w:val="o"/>
+      <w:lvlJc w:val="left"/>
+      <w:pPr>
+        <w:ind w:left="5760" w:hanging="360"/>
+      </w:pPr>
+      <w:rPr>
+        <w:rFonts w:ascii="Courier New" w:hAnsi="Courier New" w:cs="Courier New" w:hint="default"/>
+      </w:rPr>
+    </w:lvl>
+    <w:lvl w:ilvl="8" w:tplc="04250005" w:tentative="1">
+      <w:start w:val="1"/>
+      <w:numFmt w:val="bullet"/>
+      <w:lvlText w:val=""/>
+      <w:lvlJc w:val="left"/>
+      <w:pPr>
+        <w:ind w:left="6480" w:hanging="360"/>
+      </w:pPr>
+      <w:rPr>
+        <w:rFonts w:ascii="Wingdings" w:hAnsi="Wingdings" w:hint="default"/>
+      </w:rPr>
+    </w:lvl>
+  </w:abstractNum>
   <w:num w:numId="1">
+    <w:abstractNumId w:val="5"/>
+  </w:num>
+  <w:num w:numId="2">
+    <w:abstractNumId w:val="4"/>
+  </w:num>
+  <w:num w:numId="3">
+    <w:abstractNumId w:val="6"/>
+  </w:num>
+  <w:num w:numId="4">
     <w:abstractNumId w:val="2"/>
   </w:num>
-  <w:num w:numId="2">
+  <w:num w:numId="5">
+    <w:abstractNumId w:val="3"/>
+  </w:num>
+  <w:num w:numId="6">
+    <w:abstractNumId w:val="8"/>
+  </w:num>
+  <w:num w:numId="7">
     <w:abstractNumId w:val="1"/>
   </w:num>
-  <w:num w:numId="3">
-    <w:abstractNumId w:val="3"/>
+  <w:num w:numId="8">
+    <w:abstractNumId w:val="7"/>
   </w:num>
-  <w:num w:numId="4">
+  <w:num w:numId="9">
     <w:abstractNumId w:val="0"/>
   </w:num>
 </w:numbering>
@@ -1950,6 +3517,25 @@
       <w:contextualSpacing/>
     </w:pPr>
   </w:style>
+  <w:style w:type="table" w:styleId="Kontuurtabel">
+    <w:name w:val="Table Grid"/>
+    <w:basedOn w:val="Normaaltabel"/>
+    <w:uiPriority w:val="39"/>
+    <w:rsid w:val="00453C19"/>
+    <w:pPr>
+      <w:spacing w:after="0" w:line="240" w:lineRule="auto"/>
+    </w:pPr>
+    <w:tblPr>
+      <w:tblBorders>
+        <w:top w:val="single" w:sz="4" w:space="0" w:color="auto"/>
+        <w:left w:val="single" w:sz="4" w:space="0" w:color="auto"/>
+        <w:bottom w:val="single" w:sz="4" w:space="0" w:color="auto"/>
+        <w:right w:val="single" w:sz="4" w:space="0" w:color="auto"/>
+        <w:insideH w:val="single" w:sz="4" w:space="0" w:color="auto"/>
+        <w:insideV w:val="single" w:sz="4" w:space="0" w:color="auto"/>
+      </w:tblBorders>
+    </w:tblPr>
+  </w:style>
 </w:styles>
 </file>
 

</xml_diff>

<commit_message>
Fonts were added layout was Modified and everything else was updated
</commit_message>
<xml_diff>
--- a/Tech Meets Magic.docx
+++ b/Tech Meets Magic.docx
@@ -1134,12 +1134,6 @@
       <w:r>
         <w:t xml:space="preserve">Igal kasutajal on juures mängijaprofiil </w:t>
       </w:r>
-      <w:r>
-        <w:rPr>
-          <w:rFonts w:ascii="Segoe UI Emoji" w:hAnsi="Segoe UI Emoji" w:cs="Segoe UI Emoji"/>
-        </w:rPr>
-        <w:t>✅</w:t>
-      </w:r>
     </w:p>
     <w:p>
       <w:pPr>
@@ -1284,6 +1278,22 @@
       </w:r>
       <w:proofErr w:type="spellStart"/>
       <w:r>
+        <w:t>randomli</w:t>
+      </w:r>
+      <w:proofErr w:type="spellEnd"/>
+      <w:r>
+        <w:t xml:space="preserve"> ja </w:t>
+      </w:r>
+      <w:proofErr w:type="spellStart"/>
+      <w:r>
+        <w:t>selectivly</w:t>
+      </w:r>
+      <w:proofErr w:type="spellEnd"/>
+      <w:r>
+        <w:t xml:space="preserve"> </w:t>
+      </w:r>
+      <w:proofErr w:type="spellStart"/>
+      <w:r>
         <w:t>Realm’i</w:t>
       </w:r>
       <w:proofErr w:type="spellEnd"/>
@@ -1302,6 +1312,30 @@
       <w:r>
         <w:t xml:space="preserve">Mängija saab </w:t>
       </w:r>
+      <w:proofErr w:type="spellStart"/>
+      <w:r>
+        <w:t>accessida</w:t>
+      </w:r>
+      <w:proofErr w:type="spellEnd"/>
+      <w:r>
+        <w:t xml:space="preserve"> </w:t>
+      </w:r>
+      <w:proofErr w:type="spellStart"/>
+      <w:r>
+        <w:t>item</w:t>
+      </w:r>
+      <w:proofErr w:type="spellEnd"/>
+      <w:r>
+        <w:t xml:space="preserve"> </w:t>
+      </w:r>
+      <w:proofErr w:type="spellStart"/>
+      <w:r>
+        <w:t>bag</w:t>
+      </w:r>
+      <w:proofErr w:type="spellEnd"/>
+      <w:r>
+        <w:t>.</w:t>
+      </w:r>
     </w:p>
     <w:p>
       <w:pPr>
@@ -1314,6 +1348,65 @@
       <w:r>
         <w:t xml:space="preserve">Mängija saab </w:t>
       </w:r>
+      <w:r>
+        <w:t xml:space="preserve">koguda </w:t>
+      </w:r>
+      <w:proofErr w:type="spellStart"/>
+      <w:r>
+        <w:t>the</w:t>
+      </w:r>
+      <w:proofErr w:type="spellEnd"/>
+      <w:r>
+        <w:t xml:space="preserve"> </w:t>
+      </w:r>
+      <w:proofErr w:type="spellStart"/>
+      <w:r>
+        <w:t>ingame</w:t>
+      </w:r>
+      <w:proofErr w:type="spellEnd"/>
+      <w:r>
+        <w:t xml:space="preserve"> </w:t>
+      </w:r>
+      <w:proofErr w:type="spellStart"/>
+      <w:r>
+        <w:t>currency</w:t>
+      </w:r>
+      <w:proofErr w:type="spellEnd"/>
+      <w:r>
+        <w:t>. (</w:t>
+      </w:r>
+      <w:proofErr w:type="spellStart"/>
+      <w:r>
+        <w:t>Pay</w:t>
+      </w:r>
+      <w:proofErr w:type="spellEnd"/>
+      <w:r>
+        <w:t xml:space="preserve"> </w:t>
+      </w:r>
+      <w:proofErr w:type="spellStart"/>
+      <w:r>
+        <w:t>to</w:t>
+      </w:r>
+      <w:proofErr w:type="spellEnd"/>
+      <w:r>
+        <w:t xml:space="preserve"> </w:t>
+      </w:r>
+      <w:proofErr w:type="spellStart"/>
+      <w:r>
+        <w:t>win</w:t>
+      </w:r>
+      <w:proofErr w:type="spellEnd"/>
+      <w:r>
+        <w:t xml:space="preserve"> </w:t>
+      </w:r>
+      <w:proofErr w:type="spellStart"/>
+      <w:r>
+        <w:t>sucks</w:t>
+      </w:r>
+      <w:proofErr w:type="spellEnd"/>
+      <w:r>
+        <w:t>.)</w:t>
+      </w:r>
     </w:p>
     <w:p>
       <w:pPr>
@@ -1328,6 +1421,30 @@
       </w:pPr>
       <w:r>
         <w:t xml:space="preserve">Mängija saab </w:t>
+      </w:r>
+      <w:proofErr w:type="spellStart"/>
+      <w:r>
+        <w:t>Skill</w:t>
+      </w:r>
+      <w:proofErr w:type="spellEnd"/>
+      <w:r>
+        <w:t xml:space="preserve"> </w:t>
+      </w:r>
+      <w:proofErr w:type="spellStart"/>
+      <w:r>
+        <w:t>tree</w:t>
+      </w:r>
+      <w:proofErr w:type="spellEnd"/>
+      <w:r>
+        <w:t xml:space="preserve"> / </w:t>
+      </w:r>
+      <w:proofErr w:type="spellStart"/>
+      <w:r>
+        <w:t>statusid</w:t>
+      </w:r>
+      <w:proofErr w:type="spellEnd"/>
+      <w:r>
+        <w:t xml:space="preserve"> muuda</w:t>
       </w:r>
     </w:p>
     <w:p>
@@ -1483,6 +1600,22 @@
             </w:r>
             <w:proofErr w:type="spellStart"/>
             <w:r>
+              <w:t>Accidentel</w:t>
+            </w:r>
+            <w:proofErr w:type="spellEnd"/>
+            <w:r>
+              <w:t xml:space="preserve"> </w:t>
+            </w:r>
+            <w:proofErr w:type="spellStart"/>
+            <w:r>
+              <w:t>discovery</w:t>
+            </w:r>
+            <w:proofErr w:type="spellEnd"/>
+            <w:r>
+              <w:t xml:space="preserve"> of The </w:t>
+            </w:r>
+            <w:proofErr w:type="spellStart"/>
+            <w:r>
               <w:t>Ancient</w:t>
             </w:r>
             <w:proofErr w:type="spellEnd"/>
@@ -1491,15 +1624,15 @@
             </w:r>
             <w:proofErr w:type="spellStart"/>
             <w:r>
-              <w:t>Gun</w:t>
+              <w:t>Temple</w:t>
             </w:r>
             <w:proofErr w:type="spellEnd"/>
             <w:r>
-              <w:t xml:space="preserve"> </w:t>
+              <w:t xml:space="preserve"> of </w:t>
             </w:r>
             <w:proofErr w:type="spellStart"/>
             <w:r>
-              <w:t>Hole</w:t>
+              <w:t>Magnim</w:t>
             </w:r>
             <w:proofErr w:type="spellEnd"/>
             <w:r>

</xml_diff>

<commit_message>
modified everything up to date.
</commit_message>
<xml_diff>
--- a/Tech Meets Magic.docx
+++ b/Tech Meets Magic.docx
@@ -180,6 +180,66 @@
           <w:szCs w:val="24"/>
         </w:rPr>
       </w:pPr>
+      <w:proofErr w:type="spellStart"/>
+      <w:r>
+        <w:rPr>
+          <w:sz w:val="24"/>
+          <w:szCs w:val="24"/>
+        </w:rPr>
+        <w:t>GitHub’i</w:t>
+      </w:r>
+      <w:proofErr w:type="spellEnd"/>
+      <w:r>
+        <w:rPr>
+          <w:sz w:val="24"/>
+          <w:szCs w:val="24"/>
+        </w:rPr>
+        <w:t xml:space="preserve"> Link : </w:t>
+      </w:r>
+      <w:hyperlink r:id="rId5" w:history="1">
+        <w:r>
+          <w:rPr>
+            <w:rStyle w:val="Hperlink"/>
+            <w:sz w:val="24"/>
+            <w:szCs w:val="24"/>
+          </w:rPr>
+          <w:t>https://github.com/S</w:t>
+        </w:r>
+        <w:r>
+          <w:rPr>
+            <w:rStyle w:val="Hperlink"/>
+            <w:sz w:val="24"/>
+            <w:szCs w:val="24"/>
+          </w:rPr>
+          <w:t>t</w:t>
+        </w:r>
+        <w:r>
+          <w:rPr>
+            <w:rStyle w:val="Hperlink"/>
+            <w:sz w:val="24"/>
+            <w:szCs w:val="24"/>
+          </w:rPr>
+          <w:t>enChristjanUesson/Tech_Meets_Magic</w:t>
+        </w:r>
+      </w:hyperlink>
+    </w:p>
+    <w:p>
+      <w:pPr>
+        <w:spacing w:after="0"/>
+        <w:rPr>
+          <w:sz w:val="24"/>
+          <w:szCs w:val="24"/>
+        </w:rPr>
+      </w:pPr>
+    </w:p>
+    <w:p>
+      <w:pPr>
+        <w:spacing w:after="0"/>
+        <w:rPr>
+          <w:sz w:val="24"/>
+          <w:szCs w:val="24"/>
+        </w:rPr>
+      </w:pPr>
       <w:r>
         <w:rPr>
           <w:sz w:val="24"/>
@@ -216,6 +276,22 @@
           <w:szCs w:val="24"/>
         </w:rPr>
         <w:t>Kasutajad.</w:t>
+      </w:r>
+      <w:r>
+        <w:rPr>
+          <w:rFonts w:ascii="Segoe UI Emoji" w:hAnsi="Segoe UI Emoji" w:cs="Segoe UI Emoji"/>
+          <w:sz w:val="24"/>
+          <w:szCs w:val="24"/>
+        </w:rPr>
+        <w:t xml:space="preserve"> </w:t>
+      </w:r>
+      <w:r>
+        <w:rPr>
+          <w:rFonts w:ascii="Segoe UI Emoji" w:hAnsi="Segoe UI Emoji" w:cs="Segoe UI Emoji"/>
+          <w:sz w:val="24"/>
+          <w:szCs w:val="24"/>
+        </w:rPr>
+        <w:t>✅</w:t>
       </w:r>
     </w:p>
     <w:p>
@@ -1245,7 +1321,6 @@
       </w:pPr>
       <w:proofErr w:type="spellStart"/>
       <w:r>
-        <w:lastRenderedPageBreak/>
         <w:t>Gameloop</w:t>
       </w:r>
       <w:proofErr w:type="spellEnd"/>
@@ -3669,6 +3744,41 @@
       </w:tblBorders>
     </w:tblPr>
   </w:style>
+  <w:style w:type="character" w:styleId="Hperlink">
+    <w:name w:val="Hyperlink"/>
+    <w:basedOn w:val="Liguvaikefont"/>
+    <w:uiPriority w:val="99"/>
+    <w:unhideWhenUsed/>
+    <w:rsid w:val="00864FD1"/>
+    <w:rPr>
+      <w:color w:val="0563C1" w:themeColor="hyperlink"/>
+      <w:u w:val="single"/>
+    </w:rPr>
+  </w:style>
+  <w:style w:type="character" w:styleId="Lahendamatamainimine">
+    <w:name w:val="Unresolved Mention"/>
+    <w:basedOn w:val="Liguvaikefont"/>
+    <w:uiPriority w:val="99"/>
+    <w:semiHidden/>
+    <w:unhideWhenUsed/>
+    <w:rsid w:val="00864FD1"/>
+    <w:rPr>
+      <w:color w:val="605E5C"/>
+      <w:shd w:val="clear" w:color="auto" w:fill="E1DFDD"/>
+    </w:rPr>
+  </w:style>
+  <w:style w:type="character" w:styleId="Klastatudhperlink">
+    <w:name w:val="FollowedHyperlink"/>
+    <w:basedOn w:val="Liguvaikefont"/>
+    <w:uiPriority w:val="99"/>
+    <w:semiHidden/>
+    <w:unhideWhenUsed/>
+    <w:rsid w:val="00864FD1"/>
+    <w:rPr>
+      <w:color w:val="954F72" w:themeColor="followedHyperlink"/>
+      <w:u w:val="single"/>
+    </w:rPr>
+  </w:style>
 </w:styles>
 </file>
 

</xml_diff>